<commit_message>
Update synopsis and mid-semester audit (shared cache, deployment, CI, UI)
Co-Authored-By: Claude Opus 5.5 <noreply@anthropic.com>
</commit_message>
<xml_diff>
--- a/docs/Synopsis.docx
+++ b/docs/Synopsis.docx
@@ -1038,7 +1038,7 @@
           <w:b w:val="0"/>
           <w:i w:val="0"/>
         </w:rPr>
-        <w:t xml:space="preserve"> retrieves k = 5 passages. (5) If the best score is below γ, the system abstains. (6) A lightweight LLM (Gemini Flash-Lite through an OpenAI-compatible API, interchangeable with a local Qwen2.5-3B via Ollama) answers only from the passages, citing them as [n]. (7) Each answer sentence is checked against its cited passages (semantic similarity ≥ δ or high content-word overlap). Answers that fail fall back to showing the sources. (8) Validated, cacheable answers are admitted to the cache.</w:t>
+        <w:t xml:space="preserve"> retrieves k = 5 passages. (5) If the best score is below γ, the system abstains. (6) A lightweight LLM (Gemini Flash-Lite through an OpenAI-compatible API, interchangeable with a local Qwen2.5-3B via Ollama) answers only from the passages, citing them as [n]. (7) Each answer sentence is checked against its cited passages (semantic similarity ≥ δ or high content-word overlap). Answers that fail fall back to showing the sources. (8) Validated, cacheable answers are admitted to the cache. The cache is shared by all server instances through a serverless Redis store, so a verified answer produced once can be reused by every user, and survives restarts.</w:t>
       </w:r>
     </w:p>
     <w:p>
@@ -1324,7 +1324,7 @@
                 <w:i w:val="0"/>
                 <w:sz w:val="20"/>
               </w:rPr>
-              <w:t>NumPy exact cosine search; custom semantic cache (JSON / in-memory)</w:t>
+              <w:t>NumPy exact cosine search; custom semantic cache with a shared Upstash Redis store (in-memory / JSON file for local runs)</w:t>
             </w:r>
           </w:p>
         </w:tc>
@@ -1372,7 +1372,7 @@
                 <w:i w:val="0"/>
                 <w:sz w:val="20"/>
               </w:rPr>
-              <w:t>FastAPI; HTML, CSS and JavaScript front end; deployed on Vercel</w:t>
+              <w:t>FastAPI; HTML, CSS and JavaScript front end; deployed on Vercel (https://med-rac.vercel.app)</w:t>
             </w:r>
           </w:p>
         </w:tc>
@@ -1953,7 +1953,7 @@
                 <w:i w:val="0"/>
                 <w:sz w:val="20"/>
               </w:rPr>
-              <w:t>Working demonstration and preliminary results</w:t>
+              <w:t>Deployed working demonstration and preliminary results (cache safety, retrieval, abstention, end-to-end pilot)</w:t>
             </w:r>
           </w:p>
         </w:tc>
@@ -2095,7 +2095,7 @@
                 <w:i w:val="0"/>
                 <w:sz w:val="20"/>
               </w:rPr>
-              <w:t>Shared cache for deployment, ablations, significance tests, final deployment</w:t>
+              <w:t>Remaining ablations, knowledge-preloading CAG experiment, significance tests, final deployment</w:t>
             </w:r>
           </w:p>
         </w:tc>

</xml_diff>